<commit_message>
feat: change decision text
</commit_message>
<xml_diff>
--- a/web/templates/word/double_count_approval_template.docx
+++ b/web/templates/word/double_count_approval_template.docx
@@ -6,7 +6,7 @@
       <w:tblPr>
         <w:tblW w:w="3982" w:type="dxa"/>
         <w:jc w:val="left"/>
-        <w:tblInd w:w="324" w:type="dxa"/>
+        <w:tblInd w:w="432" w:type="dxa"/>
         <w:tblBorders>
           <w:top w:val="single" w:color="ffffff" w:sz="8" w:space="0" w:shadow="0" w:frame="0"/>
           <w:left w:val="single" w:color="ffffff" w:sz="8" w:space="0" w:shadow="0" w:frame="0"/>
@@ -407,12 +407,19 @@
       <w:pPr>
         <w:pStyle w:val="Corps"/>
         <w:widowControl w:val="0"/>
+        <w:ind w:left="324" w:hanging="324"/>
+      </w:pPr>
+    </w:p>
+    <w:p>
+      <w:pPr>
+        <w:pStyle w:val="Corps B"/>
+        <w:widowControl w:val="0"/>
         <w:ind w:left="216" w:hanging="216"/>
       </w:pPr>
     </w:p>
     <w:p>
       <w:pPr>
-        <w:pStyle w:val="Corps B"/>
+        <w:pStyle w:val="Corps B A"/>
         <w:widowControl w:val="0"/>
         <w:ind w:left="108" w:hanging="108"/>
       </w:pPr>
@@ -1605,6 +1612,7 @@
         <w:ind w:firstLine="720"/>
         <w:jc w:val="both"/>
         <w:rPr>
+          <w:rStyle w:val="Aucun"/>
           <w:rFonts w:ascii="Times New Roman" w:cs="Times New Roman" w:hAnsi="Times New Roman" w:eastAsia="Times New Roman"/>
         </w:rPr>
       </w:pPr>
@@ -1628,6 +1636,7 @@
       </w:r>
       <w:r>
         <w:rPr>
+          <w:rStyle w:val="Aucun"/>
           <w:rFonts w:ascii="Times New Roman" w:hAnsi="Times New Roman"/>
           <w:rtl w:val="0"/>
           <w:lang w:val="fr-FR"/>
@@ -1636,6 +1645,7 @@
       </w:r>
       <w:r>
         <w:rPr>
+          <w:rStyle w:val="Aucun"/>
           <w:rFonts w:ascii="Times New Roman" w:hAnsi="Times New Roman" w:hint="default"/>
           <w:rtl w:val="0"/>
           <w:lang w:val="fr-FR"/>
@@ -1644,6 +1654,7 @@
       </w:r>
       <w:r>
         <w:rPr>
+          <w:rStyle w:val="Aucun"/>
           <w:rFonts w:ascii="Times New Roman" w:hAnsi="Times New Roman"/>
           <w:rtl w:val="0"/>
           <w:lang w:val="fr-FR"/>
@@ -1652,6 +1663,7 @@
       </w:r>
       <w:r>
         <w:rPr>
+          <w:rStyle w:val="Aucun"/>
           <w:rFonts w:ascii="Times New Roman" w:hAnsi="Times New Roman" w:hint="default"/>
           <w:rtl w:val="0"/>
           <w:lang w:val="fr-FR"/>
@@ -1660,6 +1672,7 @@
       </w:r>
       <w:r>
         <w:rPr>
+          <w:rStyle w:val="Aucun"/>
           <w:rFonts w:ascii="Times New Roman" w:hAnsi="Times New Roman"/>
           <w:rtl w:val="0"/>
           <w:lang w:val="fr-FR"/>
@@ -1668,6 +1681,7 @@
       </w:r>
       <w:r>
         <w:rPr>
+          <w:rStyle w:val="Aucun"/>
           <w:rFonts w:ascii="Times New Roman" w:hAnsi="Times New Roman" w:hint="default"/>
           <w:rtl w:val="0"/>
           <w:lang w:val="fr-FR"/>
@@ -1676,19 +1690,12 @@
       </w:r>
       <w:r>
         <w:rPr>
-          <w:rFonts w:ascii="Times New Roman" w:hAnsi="Times New Roman"/>
-          <w:rtl w:val="0"/>
-          <w:lang w:val="fr-FR"/>
-        </w:rPr>
-        <w:t>ts, notamment son article 300 bis</w:t>
-      </w:r>
-      <w:r>
-        <w:rPr>
-          <w:rFonts w:ascii="Times New Roman" w:hAnsi="Times New Roman"/>
-          <w:rtl w:val="0"/>
-          <w:lang w:val="fr-FR"/>
-        </w:rPr>
-        <w:t xml:space="preserve"> ;</w:t>
+          <w:rStyle w:val="Aucun"/>
+          <w:rFonts w:ascii="Times New Roman" w:hAnsi="Times New Roman"/>
+          <w:rtl w:val="0"/>
+          <w:lang w:val="fr-FR"/>
+        </w:rPr>
+        <w:t>ts, notamment son article 300 bis ;</w:t>
       </w:r>
     </w:p>
     <w:p>
@@ -3159,7 +3166,7 @@
       <w:tblPr>
         <w:tblW w:w="9444" w:type="dxa"/>
         <w:jc w:val="left"/>
-        <w:tblInd w:w="432" w:type="dxa"/>
+        <w:tblInd w:w="540" w:type="dxa"/>
         <w:tblBorders>
           <w:top w:val="single" w:color="ffffff" w:sz="8" w:space="0" w:shadow="0" w:frame="0"/>
           <w:left w:val="single" w:color="ffffff" w:sz="8" w:space="0" w:shadow="0" w:frame="0"/>
@@ -3182,7 +3189,7 @@
           <w:shd w:val="clear" w:color="auto" w:fill="d0ddef"/>
         </w:tblPrEx>
         <w:trPr>
-          <w:trHeight w:val="330" w:hRule="atLeast"/>
+          <w:trHeight w:val="340" w:hRule="atLeast"/>
         </w:trPr>
         <w:tc>
           <w:tcPr>
@@ -3378,7 +3385,7 @@
           <w:shd w:val="clear" w:color="auto" w:fill="d0ddef"/>
         </w:tblPrEx>
         <w:trPr>
-          <w:trHeight w:val="630" w:hRule="atLeast"/>
+          <w:trHeight w:val="640" w:hRule="atLeast"/>
         </w:trPr>
         <w:tc>
           <w:tcPr>
@@ -3601,6 +3608,25 @@
     <w:p>
       <w:pPr>
         <w:pStyle w:val="Corps A"/>
+        <w:ind w:left="432" w:hanging="432"/>
+        <w:rPr>
+          <w:rStyle w:val="Aucun"/>
+          <w:rFonts w:ascii="Times New Roman" w:cs="Times New Roman" w:hAnsi="Times New Roman" w:eastAsia="Times New Roman"/>
+          <w:outline w:val="0"/>
+          <w:color w:val="000000"/>
+          <w:u w:color="000000"/>
+          <w:shd w:val="nil" w:color="auto" w:fill="auto"/>
+          <w14:textFill>
+            <w14:solidFill>
+              <w14:srgbClr w14:val="000000"/>
+            </w14:solidFill>
+          </w14:textFill>
+        </w:rPr>
+      </w:pPr>
+    </w:p>
+    <w:p>
+      <w:pPr>
+        <w:pStyle w:val="Corps A"/>
         <w:ind w:left="324" w:hanging="324"/>
         <w:rPr>
           <w:rStyle w:val="Aucun"/>
@@ -8004,7 +8030,7 @@
             </w14:solidFill>
           </w14:textFill>
         </w:rPr>
-        <w:t>Pour la directrice g</w:t>
+        <w:t>Pour le directeur g</w:t>
       </w:r>
       <w:r>
         <w:rPr>
@@ -8076,7 +8102,7 @@
             </w14:solidFill>
           </w14:textFill>
         </w:rPr>
-        <w:t>rale de l</w:t>
+        <w:t>ral de l</w:t>
       </w:r>
       <w:r>
         <w:rPr>
@@ -9416,6 +9442,53 @@
   <w:style w:type="paragraph" w:styleId="Corps B">
     <w:name w:val="Corps B"/>
     <w:next w:val="Corps B"/>
+    <w:pPr>
+      <w:keepNext w:val="0"/>
+      <w:keepLines w:val="0"/>
+      <w:pageBreakBefore w:val="0"/>
+      <w:widowControl w:val="1"/>
+      <w:shd w:val="clear" w:color="auto" w:fill="auto"/>
+      <w:suppressAutoHyphens w:val="0"/>
+      <w:bidi w:val="0"/>
+      <w:spacing w:before="0" w:after="0" w:line="240" w:lineRule="auto"/>
+      <w:ind w:left="0" w:right="0" w:firstLine="0"/>
+      <w:jc w:val="left"/>
+      <w:outlineLvl w:val="9"/>
+    </w:pPr>
+    <w:rPr>
+      <w:rFonts w:ascii="Times New Roman" w:cs="Times New Roman" w:hAnsi="Times New Roman" w:eastAsia="Times New Roman"/>
+      <w:b w:val="0"/>
+      <w:bCs w:val="0"/>
+      <w:i w:val="0"/>
+      <w:iCs w:val="0"/>
+      <w:caps w:val="0"/>
+      <w:smallCaps w:val="0"/>
+      <w:strike w:val="0"/>
+      <w:dstrike w:val="0"/>
+      <w:outline w:val="0"/>
+      <w:color w:val="000000"/>
+      <w:spacing w:val="0"/>
+      <w:kern w:val="0"/>
+      <w:position w:val="0"/>
+      <w:sz w:val="24"/>
+      <w:szCs w:val="24"/>
+      <w:u w:val="none" w:color="000000"/>
+      <w:shd w:val="nil" w:color="auto" w:fill="auto"/>
+      <w:vertAlign w:val="baseline"/>
+      <w14:textOutline w14:w="12700" w14:cap="flat">
+        <w14:noFill/>
+        <w14:miter w14:lim="400000"/>
+      </w14:textOutline>
+      <w14:textFill>
+        <w14:solidFill>
+          <w14:srgbClr w14:val="000000"/>
+        </w14:solidFill>
+      </w14:textFill>
+    </w:rPr>
+  </w:style>
+  <w:style w:type="paragraph" w:styleId="Corps B A">
+    <w:name w:val="Corps B A"/>
+    <w:next w:val="Corps B A"/>
     <w:pPr>
       <w:keepNext w:val="0"/>
       <w:keepLines w:val="0"/>

</xml_diff>

<commit_message>
fix: change text decision dc
</commit_message>
<xml_diff>
--- a/web/templates/word/double_count_approval_template.docx
+++ b/web/templates/word/double_count_approval_template.docx
@@ -6,7 +6,7 @@
       <w:tblPr>
         <w:tblW w:w="3982" w:type="dxa"/>
         <w:jc w:val="left"/>
-        <w:tblInd w:w="432" w:type="dxa"/>
+        <w:tblInd w:w="540" w:type="dxa"/>
         <w:tblBorders>
           <w:top w:val="single" w:color="ffffff" w:sz="8" w:space="0" w:shadow="0" w:frame="0"/>
           <w:left w:val="single" w:color="ffffff" w:sz="8" w:space="0" w:shadow="0" w:frame="0"/>
@@ -407,19 +407,26 @@
       <w:pPr>
         <w:pStyle w:val="Corps"/>
         <w:widowControl w:val="0"/>
-        <w:ind w:left="324" w:hanging="324"/>
+        <w:ind w:left="432" w:hanging="432"/>
       </w:pPr>
     </w:p>
     <w:p>
       <w:pPr>
         <w:pStyle w:val="Corps B"/>
         <w:widowControl w:val="0"/>
+        <w:ind w:left="324" w:hanging="324"/>
+      </w:pPr>
+    </w:p>
+    <w:p>
+      <w:pPr>
+        <w:pStyle w:val="Corps B A"/>
+        <w:widowControl w:val="0"/>
         <w:ind w:left="216" w:hanging="216"/>
       </w:pPr>
     </w:p>
     <w:p>
       <w:pPr>
-        <w:pStyle w:val="Corps B A"/>
+        <w:pStyle w:val="Corps B A A"/>
         <w:widowControl w:val="0"/>
         <w:ind w:left="108" w:hanging="108"/>
       </w:pPr>
@@ -1120,12 +1127,12 @@
             </w14:solidFill>
           </w14:textFill>
         </w:rPr>
-        <w:t>La directrice g</w:t>
-      </w:r>
-      <w:r>
-        <w:rPr>
-          <w:rStyle w:val="Aucun"/>
-          <w:rFonts w:ascii="Times New Roman" w:hAnsi="Times New Roman" w:hint="default"/>
+        <w:t>L</w:t>
+      </w:r>
+      <w:r>
+        <w:rPr>
+          <w:rStyle w:val="Aucun"/>
+          <w:rFonts w:ascii="Times New Roman" w:hAnsi="Times New Roman"/>
           <w:b w:val="1"/>
           <w:bCs w:val="1"/>
           <w:outline w:val="0"/>
@@ -1140,7 +1147,7 @@
             </w14:solidFill>
           </w14:textFill>
         </w:rPr>
-        <w:t>é</w:t>
+        <w:t>e directeur</w:t>
       </w:r>
       <w:r>
         <w:rPr>
@@ -1160,7 +1167,7 @@
             </w14:solidFill>
           </w14:textFill>
         </w:rPr>
-        <w:t>n</w:t>
+        <w:t xml:space="preserve"> g</w:t>
       </w:r>
       <w:r>
         <w:rPr>
@@ -1200,7 +1207,47 @@
             </w14:solidFill>
           </w14:textFill>
         </w:rPr>
-        <w:t>rale de l</w:t>
+        <w:t>n</w:t>
+      </w:r>
+      <w:r>
+        <w:rPr>
+          <w:rStyle w:val="Aucun"/>
+          <w:rFonts w:ascii="Times New Roman" w:hAnsi="Times New Roman" w:hint="default"/>
+          <w:b w:val="1"/>
+          <w:bCs w:val="1"/>
+          <w:outline w:val="0"/>
+          <w:color w:val="000000"/>
+          <w:u w:color="000000"/>
+          <w:shd w:val="nil" w:color="auto" w:fill="auto"/>
+          <w:rtl w:val="0"/>
+          <w:lang w:val="fr-FR"/>
+          <w14:textFill>
+            <w14:solidFill>
+              <w14:srgbClr w14:val="000000"/>
+            </w14:solidFill>
+          </w14:textFill>
+        </w:rPr>
+        <w:t>é</w:t>
+      </w:r>
+      <w:r>
+        <w:rPr>
+          <w:rStyle w:val="Aucun"/>
+          <w:rFonts w:ascii="Times New Roman" w:hAnsi="Times New Roman"/>
+          <w:b w:val="1"/>
+          <w:bCs w:val="1"/>
+          <w:outline w:val="0"/>
+          <w:color w:val="000000"/>
+          <w:u w:color="000000"/>
+          <w:shd w:val="nil" w:color="auto" w:fill="auto"/>
+          <w:rtl w:val="0"/>
+          <w:lang w:val="fr-FR"/>
+          <w14:textFill>
+            <w14:solidFill>
+              <w14:srgbClr w14:val="000000"/>
+            </w14:solidFill>
+          </w14:textFill>
+        </w:rPr>
+        <w:t>ral de l</w:t>
       </w:r>
       <w:r>
         <w:rPr>
@@ -3166,7 +3213,7 @@
       <w:tblPr>
         <w:tblW w:w="9444" w:type="dxa"/>
         <w:jc w:val="left"/>
-        <w:tblInd w:w="540" w:type="dxa"/>
+        <w:tblInd w:w="648" w:type="dxa"/>
         <w:tblBorders>
           <w:top w:val="single" w:color="ffffff" w:sz="8" w:space="0" w:shadow="0" w:frame="0"/>
           <w:left w:val="single" w:color="ffffff" w:sz="8" w:space="0" w:shadow="0" w:frame="0"/>
@@ -3189,7 +3236,7 @@
           <w:shd w:val="clear" w:color="auto" w:fill="d0ddef"/>
         </w:tblPrEx>
         <w:trPr>
-          <w:trHeight w:val="340" w:hRule="atLeast"/>
+          <w:trHeight w:val="350" w:hRule="atLeast"/>
         </w:trPr>
         <w:tc>
           <w:tcPr>
@@ -3385,7 +3432,7 @@
           <w:shd w:val="clear" w:color="auto" w:fill="d0ddef"/>
         </w:tblPrEx>
         <w:trPr>
-          <w:trHeight w:val="640" w:hRule="atLeast"/>
+          <w:trHeight w:val="650" w:hRule="atLeast"/>
         </w:trPr>
         <w:tc>
           <w:tcPr>
@@ -3605,6 +3652,25 @@
         </w:tc>
       </w:tr>
     </w:tbl>
+    <w:p>
+      <w:pPr>
+        <w:pStyle w:val="Corps A"/>
+        <w:ind w:left="540" w:hanging="540"/>
+        <w:rPr>
+          <w:rStyle w:val="Aucun"/>
+          <w:rFonts w:ascii="Times New Roman" w:cs="Times New Roman" w:hAnsi="Times New Roman" w:eastAsia="Times New Roman"/>
+          <w:outline w:val="0"/>
+          <w:color w:val="000000"/>
+          <w:u w:color="000000"/>
+          <w:shd w:val="nil" w:color="auto" w:fill="auto"/>
+          <w14:textFill>
+            <w14:solidFill>
+              <w14:srgbClr w14:val="000000"/>
+            </w14:solidFill>
+          </w14:textFill>
+        </w:rPr>
+      </w:pPr>
+    </w:p>
     <w:p>
       <w:pPr>
         <w:pStyle w:val="Corps A"/>
@@ -9489,6 +9555,53 @@
   <w:style w:type="paragraph" w:styleId="Corps B A">
     <w:name w:val="Corps B A"/>
     <w:next w:val="Corps B A"/>
+    <w:pPr>
+      <w:keepNext w:val="0"/>
+      <w:keepLines w:val="0"/>
+      <w:pageBreakBefore w:val="0"/>
+      <w:widowControl w:val="1"/>
+      <w:shd w:val="clear" w:color="auto" w:fill="auto"/>
+      <w:suppressAutoHyphens w:val="0"/>
+      <w:bidi w:val="0"/>
+      <w:spacing w:before="0" w:after="0" w:line="240" w:lineRule="auto"/>
+      <w:ind w:left="0" w:right="0" w:firstLine="0"/>
+      <w:jc w:val="left"/>
+      <w:outlineLvl w:val="9"/>
+    </w:pPr>
+    <w:rPr>
+      <w:rFonts w:ascii="Times New Roman" w:cs="Times New Roman" w:hAnsi="Times New Roman" w:eastAsia="Times New Roman"/>
+      <w:b w:val="0"/>
+      <w:bCs w:val="0"/>
+      <w:i w:val="0"/>
+      <w:iCs w:val="0"/>
+      <w:caps w:val="0"/>
+      <w:smallCaps w:val="0"/>
+      <w:strike w:val="0"/>
+      <w:dstrike w:val="0"/>
+      <w:outline w:val="0"/>
+      <w:color w:val="000000"/>
+      <w:spacing w:val="0"/>
+      <w:kern w:val="0"/>
+      <w:position w:val="0"/>
+      <w:sz w:val="24"/>
+      <w:szCs w:val="24"/>
+      <w:u w:val="none" w:color="000000"/>
+      <w:shd w:val="nil" w:color="auto" w:fill="auto"/>
+      <w:vertAlign w:val="baseline"/>
+      <w14:textOutline w14:w="12700" w14:cap="flat">
+        <w14:noFill/>
+        <w14:miter w14:lim="400000"/>
+      </w14:textOutline>
+      <w14:textFill>
+        <w14:solidFill>
+          <w14:srgbClr w14:val="000000"/>
+        </w14:solidFill>
+      </w14:textFill>
+    </w:rPr>
+  </w:style>
+  <w:style w:type="paragraph" w:styleId="Corps B A A">
+    <w:name w:val="Corps B A A"/>
+    <w:next w:val="Corps B A A"/>
     <w:pPr>
       <w:keepNext w:val="0"/>
       <w:keepLines w:val="0"/>

</xml_diff>